<commit_message>
docs: open repository to contributors
</commit_message>
<xml_diff>
--- a/docs/FDE_AGENT_SKILLS_HANDBOOK.docx
+++ b/docs/FDE_AGENT_SKILLS_HANDBOOK.docx
@@ -48,7 +48,7 @@
           <w:color w:val="1F4D78"/>
           <w:sz w:val="30"/>
         </w:rPr>
-        <w:t>Installation, Operating Model, Scenarios, and a Fully Worked Engagement</w:t>
+        <w:t>Installation, Operating Model, Scenarios, Worked Engagement, and Contributions</w:t>
       </w:r>
     </w:p>
     <w:p>
@@ -86,7 +86,7 @@
           <w:color w:val="667085"/>
           <w:sz w:val="19"/>
         </w:rPr>
-        <w:t>github.com/1aifanatic/fde-agent-skills (private)</w:t>
+        <w:t>github.com/1aifanatic/fde-agent-skills (public)</w:t>
       </w:r>
     </w:p>
     <w:p>
@@ -189,7 +189,7 @@
     </w:p>
     <w:p>
       <w:r>
-        <w:t>Read Part I to install the skills. Use Part II while running engagements. Use Part III to explain the value to stakeholders. Parts IV–VI show the complete synthetic execution and its impact. Part VII documents the reproducibility and validation evidence.</w:t>
+        <w:t>Read Part I to install the skills. Use Part II while running engagements. Use Part III to explain the value to stakeholders. Parts IV–VI show the complete synthetic execution and its impact. Part VII documents the reproducibility and validation evidence. Part VIII explains how to contribute safely.</w:t>
       </w:r>
     </w:p>
     <w:p>
@@ -211,7 +211,7 @@
           <w:color w:val="222222"/>
           <w:sz w:val="22"/>
         </w:rPr>
-        <w:t>Install and verify the private repository</w:t>
+        <w:t>Install and verify the public repository</w:t>
       </w:r>
     </w:p>
     <w:p>
@@ -348,6 +348,28 @@
     </w:p>
     <w:p>
       <w:pPr>
+        <w:pStyle w:val="ListBullet"/>
+      </w:pPr>
+      <w:r>
+        <w:rPr>
+          <w:rFonts w:ascii="Calibri" w:hAnsi="Calibri"/>
+          <w:b/>
+          <w:color w:val="19324D"/>
+          <w:sz w:val="22"/>
+        </w:rPr>
+        <w:t xml:space="preserve">Part VIII: </w:t>
+      </w:r>
+      <w:r>
+        <w:rPr>
+          <w:rFonts w:ascii="Calibri" w:hAnsi="Calibri"/>
+          <w:color w:val="222222"/>
+          <w:sz w:val="22"/>
+        </w:rPr>
+        <w:t>Propose, validate, and submit a safe contribution</w:t>
+      </w:r>
+    </w:p>
+    <w:p>
+      <w:pPr>
         <w:spacing w:before="200"/>
       </w:pPr>
       <w:r>
@@ -399,7 +421,7 @@
     </w:p>
     <w:p>
       <w:r>
-        <w:t>This guide installs the private 1aifanatic/fde-agent-skills repository through the open skills CLI. The repository contains six independent skills that are discovered from their SKILL.md files.</w:t>
+        <w:t>This guide installs the public 1aifanatic/fde-agent-skills repository through the open skills CLI. The repository contains six independent skills that are discovered from their SKILL.md files.</w:t>
       </w:r>
     </w:p>
     <w:p>
@@ -453,29 +475,11 @@
           <w:sz w:val="17"/>
         </w:rPr>
         <w:t>git --version</w:t>
-        <w:br/>
-      </w:r>
-      <w:r>
-        <w:rPr>
-          <w:rFonts w:ascii="Consolas" w:hAnsi="Consolas"/>
-          <w:color w:val="19324D"/>
-          <w:sz w:val="17"/>
-        </w:rPr>
-        <w:t>gh --version</w:t>
-        <w:br/>
-      </w:r>
-      <w:r>
-        <w:rPr>
-          <w:rFonts w:ascii="Consolas" w:hAnsi="Consolas"/>
-          <w:color w:val="19324D"/>
-          <w:sz w:val="17"/>
-        </w:rPr>
-        <w:t>gh auth status</w:t>
-      </w:r>
-    </w:p>
-    <w:p>
-      <w:r>
-        <w:t>The GitHub account reported by gh auth status must have read access to the private repository.</w:t>
+      </w:r>
+    </w:p>
+    <w:p>
+      <w:r>
+        <w:t>No GitHub account or access token is required for the public HTTPS installation.</w:t>
       </w:r>
     </w:p>
     <w:p>
@@ -511,7 +515,7 @@
           <w:color w:val="19324D"/>
           <w:sz w:val="17"/>
         </w:rPr>
-        <w:t>npx --yes skills@latest add 1aifanatic/fde-agent-skills --skill '*' --agent codex --global --copy --yes</w:t>
+        <w:t>npx --yes skills@latest add https://github.com/1aifanatic/fde-agent-skills.git --skill '*' --agent codex --global --copy --yes</w:t>
       </w:r>
     </w:p>
     <w:p>
@@ -529,8 +533,8 @@
         <w:tblInd w:w="120" w:type="dxa"/>
       </w:tblPr>
       <w:tblGrid>
-        <w:gridCol w:w="3768"/>
-        <w:gridCol w:w="5592"/>
+        <w:gridCol w:w="4680"/>
+        <w:gridCol w:w="4680"/>
       </w:tblGrid>
       <w:tr>
         <w:trPr>
@@ -540,7 +544,7 @@
         </w:trPr>
         <w:tc>
           <w:tcPr>
-            <w:tcW w:type="dxa" w:w="3768"/>
+            <w:tcW w:type="dxa" w:w="4680"/>
             <w:tcMar>
               <w:top w:w="80" w:type="dxa"/>
               <w:start w:w="120" w:type="dxa"/>
@@ -567,7 +571,7 @@
         </w:tc>
         <w:tc>
           <w:tcPr>
-            <w:tcW w:type="dxa" w:w="5592"/>
+            <w:tcW w:type="dxa" w:w="4680"/>
             <w:tcMar>
               <w:top w:w="80" w:type="dxa"/>
               <w:start w:w="120" w:type="dxa"/>
@@ -599,7 +603,7 @@
         </w:trPr>
         <w:tc>
           <w:tcPr>
-            <w:tcW w:type="dxa" w:w="3768"/>
+            <w:tcW w:type="dxa" w:w="4680"/>
             <w:tcMar>
               <w:top w:w="80" w:type="dxa"/>
               <w:start w:w="120" w:type="dxa"/>
@@ -623,7 +627,7 @@
         </w:tc>
         <w:tc>
           <w:tcPr>
-            <w:tcW w:type="dxa" w:w="5592"/>
+            <w:tcW w:type="dxa" w:w="4680"/>
             <w:tcMar>
               <w:top w:w="80" w:type="dxa"/>
               <w:start w:w="120" w:type="dxa"/>
@@ -652,7 +656,7 @@
         </w:trPr>
         <w:tc>
           <w:tcPr>
-            <w:tcW w:type="dxa" w:w="3768"/>
+            <w:tcW w:type="dxa" w:w="4680"/>
             <w:tcMar>
               <w:top w:w="80" w:type="dxa"/>
               <w:start w:w="120" w:type="dxa"/>
@@ -676,7 +680,7 @@
         </w:tc>
         <w:tc>
           <w:tcPr>
-            <w:tcW w:type="dxa" w:w="5592"/>
+            <w:tcW w:type="dxa" w:w="4680"/>
             <w:tcMar>
               <w:top w:w="80" w:type="dxa"/>
               <w:start w:w="120" w:type="dxa"/>
@@ -705,7 +709,7 @@
         </w:trPr>
         <w:tc>
           <w:tcPr>
-            <w:tcW w:type="dxa" w:w="3768"/>
+            <w:tcW w:type="dxa" w:w="4680"/>
             <w:tcMar>
               <w:top w:w="80" w:type="dxa"/>
               <w:start w:w="120" w:type="dxa"/>
@@ -723,13 +727,13 @@
                 <w:rFonts w:ascii="Calibri" w:hAnsi="Calibri"/>
                 <w:sz w:val="17"/>
               </w:rPr>
-              <w:t>add 1aifanatic/fde-agent-skills</w:t>
+              <w:t>add https://github.com/1aifanatic/fde-agent-skills.git</w:t>
             </w:r>
           </w:p>
         </w:tc>
         <w:tc>
           <w:tcPr>
-            <w:tcW w:type="dxa" w:w="5592"/>
+            <w:tcW w:type="dxa" w:w="4680"/>
             <w:tcMar>
               <w:top w:w="80" w:type="dxa"/>
               <w:start w:w="120" w:type="dxa"/>
@@ -747,7 +751,7 @@
                 <w:rFonts w:ascii="Calibri" w:hAnsi="Calibri"/>
                 <w:sz w:val="17"/>
               </w:rPr>
-              <w:t>Reads the private GitHub repository</w:t>
+              <w:t>Reads the public GitHub repository</w:t>
             </w:r>
           </w:p>
         </w:tc>
@@ -758,7 +762,7 @@
         </w:trPr>
         <w:tc>
           <w:tcPr>
-            <w:tcW w:type="dxa" w:w="3768"/>
+            <w:tcW w:type="dxa" w:w="4680"/>
             <w:tcMar>
               <w:top w:w="80" w:type="dxa"/>
               <w:start w:w="120" w:type="dxa"/>
@@ -782,7 +786,7 @@
         </w:tc>
         <w:tc>
           <w:tcPr>
-            <w:tcW w:type="dxa" w:w="5592"/>
+            <w:tcW w:type="dxa" w:w="4680"/>
             <w:tcMar>
               <w:top w:w="80" w:type="dxa"/>
               <w:start w:w="120" w:type="dxa"/>
@@ -811,7 +815,7 @@
         </w:trPr>
         <w:tc>
           <w:tcPr>
-            <w:tcW w:type="dxa" w:w="3768"/>
+            <w:tcW w:type="dxa" w:w="4680"/>
             <w:tcMar>
               <w:top w:w="80" w:type="dxa"/>
               <w:start w:w="120" w:type="dxa"/>
@@ -835,7 +839,7 @@
         </w:tc>
         <w:tc>
           <w:tcPr>
-            <w:tcW w:type="dxa" w:w="5592"/>
+            <w:tcW w:type="dxa" w:w="4680"/>
             <w:tcMar>
               <w:top w:w="80" w:type="dxa"/>
               <w:start w:w="120" w:type="dxa"/>
@@ -864,7 +868,7 @@
         </w:trPr>
         <w:tc>
           <w:tcPr>
-            <w:tcW w:type="dxa" w:w="3768"/>
+            <w:tcW w:type="dxa" w:w="4680"/>
             <w:tcMar>
               <w:top w:w="80" w:type="dxa"/>
               <w:start w:w="120" w:type="dxa"/>
@@ -888,7 +892,7 @@
         </w:tc>
         <w:tc>
           <w:tcPr>
-            <w:tcW w:type="dxa" w:w="5592"/>
+            <w:tcW w:type="dxa" w:w="4680"/>
             <w:tcMar>
               <w:top w:w="80" w:type="dxa"/>
               <w:start w:w="120" w:type="dxa"/>
@@ -917,7 +921,7 @@
         </w:trPr>
         <w:tc>
           <w:tcPr>
-            <w:tcW w:type="dxa" w:w="3768"/>
+            <w:tcW w:type="dxa" w:w="4680"/>
             <w:tcMar>
               <w:top w:w="80" w:type="dxa"/>
               <w:start w:w="120" w:type="dxa"/>
@@ -941,7 +945,7 @@
         </w:tc>
         <w:tc>
           <w:tcPr>
-            <w:tcW w:type="dxa" w:w="5592"/>
+            <w:tcW w:type="dxa" w:w="4680"/>
             <w:tcMar>
               <w:top w:w="80" w:type="dxa"/>
               <w:start w:w="120" w:type="dxa"/>
@@ -970,7 +974,7 @@
         </w:trPr>
         <w:tc>
           <w:tcPr>
-            <w:tcW w:type="dxa" w:w="3768"/>
+            <w:tcW w:type="dxa" w:w="4680"/>
             <w:tcMar>
               <w:top w:w="80" w:type="dxa"/>
               <w:start w:w="120" w:type="dxa"/>
@@ -994,7 +998,7 @@
         </w:tc>
         <w:tc>
           <w:tcPr>
-            <w:tcW w:type="dxa" w:w="5592"/>
+            <w:tcW w:type="dxa" w:w="4680"/>
             <w:tcMar>
               <w:top w:w="80" w:type="dxa"/>
               <w:start w:w="120" w:type="dxa"/>
@@ -1023,7 +1027,7 @@
         </w:trPr>
         <w:tc>
           <w:tcPr>
-            <w:tcW w:type="dxa" w:w="3768"/>
+            <w:tcW w:type="dxa" w:w="4680"/>
             <w:tcMar>
               <w:top w:w="80" w:type="dxa"/>
               <w:start w:w="120" w:type="dxa"/>
@@ -1047,7 +1051,7 @@
         </w:tc>
         <w:tc>
           <w:tcPr>
-            <w:tcW w:type="dxa" w:w="5592"/>
+            <w:tcW w:type="dxa" w:w="4680"/>
             <w:tcMar>
               <w:top w:w="80" w:type="dxa"/>
               <w:start w:w="120" w:type="dxa"/>
@@ -1114,7 +1118,7 @@
           <w:color w:val="19324D"/>
           <w:sz w:val="17"/>
         </w:rPr>
-        <w:t>npx --yes skills@latest add 1aifanatic/fde-agent-skills --skill '*' --agent codex --copy --yes</w:t>
+        <w:t>npx --yes skills@latest add https://github.com/1aifanatic/fde-agent-skills.git --skill '*' --agent codex --copy --yes</w:t>
       </w:r>
     </w:p>
     <w:p>
@@ -1154,12 +1158,12 @@
         <w:pStyle w:val="Heading2"/>
       </w:pPr>
       <w:r>
-        <w:t>Private-repository authentication</w:t>
-      </w:r>
-    </w:p>
-    <w:p>
-      <w:r>
-        <w:t>The skills CLI supports private repositories by using existing Git, GitHub CLI, or SSH authentication.</w:t>
+        <w:t>Alternative Git transports and CI</w:t>
+      </w:r>
+    </w:p>
+    <w:p>
+      <w:r>
+        <w:t>The recommended public HTTPS command requires no authentication. Use an alternate transport only when your environment requires it.</w:t>
       </w:r>
     </w:p>
     <w:p>
@@ -1167,12 +1171,12 @@
         <w:pStyle w:val="Heading3"/>
       </w:pPr>
       <w:r>
-        <w:t>GitHub CLI authentication</w:t>
-      </w:r>
-    </w:p>
-    <w:p>
-      <w:r>
-        <w:t>Recommended on developer machines:</w:t>
+        <w:t>Optional GitHub CLI authentication</w:t>
+      </w:r>
+    </w:p>
+    <w:p>
+      <w:r>
+        <w:t>GitHub CLI authentication is optional and can help diagnose account-level network or rate-limit issues:</w:t>
       </w:r>
     </w:p>
     <w:p>
@@ -1204,12 +1208,21 @@
           <w:color w:val="19324D"/>
           <w:sz w:val="17"/>
         </w:rPr>
+        <w:t>gh auth setup-git</w:t>
+        <w:br/>
+      </w:r>
+      <w:r>
+        <w:rPr>
+          <w:rFonts w:ascii="Consolas" w:hAnsi="Consolas"/>
+          <w:color w:val="19324D"/>
+          <w:sz w:val="17"/>
+        </w:rPr>
         <w:t>gh repo view 1aifanatic/fde-agent-skills</w:t>
       </w:r>
     </w:p>
     <w:p>
       <w:r>
-        <w:t>Do not paste tokens into the install command. The CLI can use the authenticated GitHub CLI path without printing or copying the credential.</w:t>
+        <w:t>Do not paste tokens into the install command or logs.</w:t>
       </w:r>
     </w:p>
     <w:p>
@@ -1262,12 +1275,12 @@
         <w:pStyle w:val="Heading3"/>
       </w:pPr>
       <w:r>
-        <w:t>Explicit environment token</w:t>
-      </w:r>
-    </w:p>
-    <w:p>
-      <w:r>
-        <w:t>For a CI worker that cannot use gh or SSH, supply a short-lived, least-privilege token through the secret manager:</w:t>
+        <w:t>CI installation</w:t>
+      </w:r>
+    </w:p>
+    <w:p>
+      <w:r>
+        <w:t>Public CI workers can install without a repository token:</w:t>
       </w:r>
     </w:p>
     <w:p>
@@ -1275,15 +1288,6 @@
         <w:pStyle w:val="CodeBlock"/>
         <w:shd w:fill="F2F4F7"/>
       </w:pPr>
-      <w:r>
-        <w:rPr>
-          <w:rFonts w:ascii="Consolas" w:hAnsi="Consolas"/>
-          <w:color w:val="19324D"/>
-          <w:sz w:val="17"/>
-        </w:rPr>
-        <w:t>$env:GITHUB_TOKEN = $env:FDE_SKILLS_READ_TOKEN</w:t>
-        <w:br/>
-      </w:r>
       <w:r>
         <w:rPr>
           <w:rFonts w:ascii="Consolas" w:hAnsi="Consolas"/>
@@ -1299,21 +1303,12 @@
           <w:color w:val="19324D"/>
           <w:sz w:val="17"/>
         </w:rPr>
-        <w:t>npx --yes skills@latest add 1aifanatic/fde-agent-skills --skill '*' --agent codex --copy --yes</w:t>
-        <w:br/>
-      </w:r>
-      <w:r>
-        <w:rPr>
-          <w:rFonts w:ascii="Consolas" w:hAnsi="Consolas"/>
-          <w:color w:val="19324D"/>
-          <w:sz w:val="17"/>
-        </w:rPr>
-        <w:t>Remove-Item Env:GITHUB_TOKEN</w:t>
-      </w:r>
-    </w:p>
-    <w:p>
-      <w:r>
-        <w:t>Never commit a token, place it in README output, or echo it in logs.</w:t>
+        <w:t>npx --yes skills@latest add https://github.com/1aifanatic/fde-agent-skills.git --skill '*' --agent codex --copy --yes</w:t>
+      </w:r>
+    </w:p>
+    <w:p>
+      <w:r>
+        <w:t>If your organization requires authenticated GitHub access, inject a short-lived least-privilege token through its secret manager. Never commit or print it.</w:t>
       </w:r>
     </w:p>
     <w:p>
@@ -1349,7 +1344,7 @@
           <w:color w:val="19324D"/>
           <w:sz w:val="17"/>
         </w:rPr>
-        <w:t>npx --yes skills@latest add 1aifanatic/fde-agent-skills --list</w:t>
+        <w:t>npx --yes skills@latest add https://github.com/1aifanatic/fde-agent-skills.git --list</w:t>
       </w:r>
     </w:p>
     <w:p>
@@ -1443,7 +1438,7 @@
           <w:color w:val="19324D"/>
           <w:sz w:val="17"/>
         </w:rPr>
-        <w:t>npx --yes skills@latest add 1aifanatic/fde-agent-skills --skill fde-interview-engagement --skill fde-capture-knowledge --agent codex --global --copy --yes</w:t>
+        <w:t>npx --yes skills@latest add https://github.com/1aifanatic/fde-agent-skills.git --skill fde-interview-engagement --skill fde-capture-knowledge --agent codex --global --copy --yes</w:t>
       </w:r>
     </w:p>
     <w:p>
@@ -1748,12 +1743,12 @@
         <w:pStyle w:val="Heading2"/>
       </w:pPr>
       <w:r>
-        <w:t>Telemetry and private repositories</w:t>
-      </w:r>
-    </w:p>
-    <w:p>
-      <w:r>
-        <w:t>The upstream CLI documents that GitHub repository and skill identifiers are sent only when GitHub confirms the repository is public. This repository is private. This guide still sets DISABLE_TELEMETRY=1 as a conservative default.</w:t>
+        <w:t>Telemetry</w:t>
+      </w:r>
+    </w:p>
+    <w:p>
+      <w:r>
+        <w:t>The upstream CLI documents its telemetry behavior for public repositories. This guide sets DISABLE_TELEMETRY=1 as a conservative default; omit it if your organization permits the CLI's documented telemetry.</w:t>
       </w:r>
     </w:p>
     <w:p>
@@ -1795,7 +1790,7 @@
     </w:p>
     <w:p>
       <w:r>
-        <w:t>Check access independently:</w:t>
+        <w:t>Check public access independently:</w:t>
       </w:r>
     </w:p>
     <w:p>
@@ -1803,24 +1798,6 @@
         <w:pStyle w:val="CodeBlock"/>
         <w:shd w:fill="F2F4F7"/>
       </w:pPr>
-      <w:r>
-        <w:rPr>
-          <w:rFonts w:ascii="Consolas" w:hAnsi="Consolas"/>
-          <w:color w:val="19324D"/>
-          <w:sz w:val="17"/>
-        </w:rPr>
-        <w:t>gh auth status</w:t>
-        <w:br/>
-      </w:r>
-      <w:r>
-        <w:rPr>
-          <w:rFonts w:ascii="Consolas" w:hAnsi="Consolas"/>
-          <w:color w:val="19324D"/>
-          <w:sz w:val="17"/>
-        </w:rPr>
-        <w:t>gh repo view 1aifanatic/fde-agent-skills</w:t>
-        <w:br/>
-      </w:r>
       <w:r>
         <w:rPr>
           <w:rFonts w:ascii="Consolas" w:hAnsi="Consolas"/>
@@ -1859,7 +1836,7 @@
           <w:color w:val="19324D"/>
           <w:sz w:val="17"/>
         </w:rPr>
-        <w:t>npx --yes skills@latest add 1aifanatic/fde-agent-skills --skill '*' --agent codex --copy --yes</w:t>
+        <w:t>npx --yes skills@latest add https://github.com/1aifanatic/fde-agent-skills.git --skill '*' --agent codex --copy --yes</w:t>
       </w:r>
     </w:p>
     <w:p>
@@ -1967,12 +1944,12 @@
         <w:pStyle w:val="Heading3"/>
       </w:pPr>
       <w:r>
-        <w:t>CI installation</w:t>
-      </w:r>
-    </w:p>
-    <w:p>
-      <w:r>
-        <w:t>Use a secret-managed read token, project scope, --copy, --yes, and disabled telemetry. Review the installed skill source during the build, and avoid persisting credentials in artifacts or logs.</w:t>
+        <w:t>CI troubleshooting</w:t>
+      </w:r>
+    </w:p>
+    <w:p>
+      <w:r>
+        <w:t>Use project scope, --copy, --yes, and disabled telemetry. Review the installed skill source during the build. Add GitHub credentials only when required by organizational network or rate-limit policy, and never persist them in artifacts or logs.</w:t>
       </w:r>
     </w:p>
     <w:p>
@@ -9093,7 +9070,7 @@
         <w:pStyle w:val="Heading2"/>
       </w:pPr>
       <w:r>
-        <w:t>Private npx installation smoke test</w:t>
+        <w:t>Public npx installation smoke test</w:t>
       </w:r>
     </w:p>
     <w:p>
@@ -9149,7 +9126,7 @@
         <w:pStyle w:val="ListBullet"/>
       </w:pPr>
       <w:r>
-        <w:t>Repository: private 1aifanatic/fde-agent-skills</w:t>
+        <w:t>Repository: public 1aifanatic/fde-agent-skills</w:t>
       </w:r>
     </w:p>
     <w:p>
@@ -9157,7 +9134,7 @@
         <w:pStyle w:val="ListBullet"/>
       </w:pPr>
       <w:r>
-        <w:t>Authentication: existing GitHub CLI/Git credentials</w:t>
+        <w:t>Authentication: none required for HTTPS installation</w:t>
       </w:r>
     </w:p>
     <w:p>
@@ -9220,12 +9197,12 @@
           <w:color w:val="19324D"/>
           <w:sz w:val="17"/>
         </w:rPr>
-        <w:t>npx --yes skills@latest add 1aifanatic/fde-agent-skills --list</w:t>
-      </w:r>
-    </w:p>
-    <w:p>
-      <w:r>
-        <w:t>Observed result: the CLI cloned the private repository and found exactly six skills.</w:t>
+        <w:t>npx --yes skills@latest add https://github.com/1aifanatic/fde-agent-skills.git --list</w:t>
+      </w:r>
+    </w:p>
+    <w:p>
+      <w:r>
+        <w:t>Observed result: the CLI cloned the repository and found exactly six skills.</w:t>
       </w:r>
     </w:p>
     <w:p>
@@ -9256,7 +9233,7 @@
           <w:color w:val="19324D"/>
           <w:sz w:val="17"/>
         </w:rPr>
-        <w:t>npx --yes skills@latest add 1aifanatic/fde-agent-skills --skill '*' --agent codex --copy --yes</w:t>
+        <w:t>npx --yes skills@latest add https://github.com/1aifanatic/fde-agent-skills.git --skill '*' --agent codex --copy --yes</w:t>
       </w:r>
     </w:p>
     <w:p>
@@ -9801,6 +9778,552 @@
         <w:pStyle w:val="Heading1"/>
       </w:pPr>
       <w:r>
+        <w:t>Part VIII — Contributing</w:t>
+      </w:r>
+    </w:p>
+    <w:p>
+      <w:pPr>
+        <w:spacing w:after="200"/>
+      </w:pPr>
+      <w:r>
+        <w:rPr>
+          <w:rFonts w:ascii="Calibri" w:hAnsi="Calibri"/>
+          <w:b/>
+          <w:color w:val="667085"/>
+          <w:sz w:val="17"/>
+        </w:rPr>
+        <w:t xml:space="preserve">Maintained source: </w:t>
+      </w:r>
+      <w:r>
+        <w:rPr>
+          <w:rFonts w:ascii="Calibri" w:hAnsi="Calibri"/>
+          <w:color w:val="667085"/>
+          <w:sz w:val="17"/>
+        </w:rPr>
+        <w:t>CONTRIBUTING.md</w:t>
+      </w:r>
+    </w:p>
+    <w:p>
+      <w:r>
+        <w:t>Thank you for helping make forward deployed engineering more rigorous, reusable, and safe. Contributions from FDEs, operators, process owners, architects, automation engineers, AI engineers, security practitioners, and technical writers are welcome.</w:t>
+      </w:r>
+    </w:p>
+    <w:p>
+      <w:pPr>
+        <w:pStyle w:val="Heading2"/>
+      </w:pPr>
+      <w:r>
+        <w:t>Start here</w:t>
+      </w:r>
+    </w:p>
+    <w:p>
+      <w:pPr>
+        <w:pStyle w:val="ListNumber"/>
+      </w:pPr>
+      <w:r>
+        <w:t xml:space="preserve">Search the </w:t>
+      </w:r>
+      <w:hyperlink r:id="rId21">
+        <w:r>
+          <w:rPr>
+            <w:color w:val="2E74B5"/>
+            <w:u w:val="single"/>
+          </w:rPr>
+          <w:t>existing issues</w:t>
+        </w:r>
+      </w:hyperlink>
+      <w:r>
+        <w:t>.</w:t>
+      </w:r>
+    </w:p>
+    <w:p>
+      <w:pPr>
+        <w:pStyle w:val="ListNumber"/>
+      </w:pPr>
+      <w:r>
+        <w:t>For a small correction, open a focused pull request.</w:t>
+      </w:r>
+    </w:p>
+    <w:p>
+      <w:pPr>
+        <w:pStyle w:val="ListNumber"/>
+      </w:pPr>
+      <w:r>
+        <w:t>For a new skill, workspace-contract change, lifecycle-gate change, or large redesign, open an issue first so the behavior and migration impact can be discussed.</w:t>
+      </w:r>
+    </w:p>
+    <w:p>
+      <w:pPr>
+        <w:pStyle w:val="ListNumber"/>
+      </w:pPr>
+      <w:r>
+        <w:t>Use only synthetic, anonymized, or explicitly authorized material.</w:t>
+      </w:r>
+    </w:p>
+    <w:p>
+      <w:r>
+        <w:t>This repository does not currently include a software license. Public visibility permits review and contribution discussion but does not by itself grant reuse rights. If licensing affects a proposed contribution, raise it before doing substantial work.</w:t>
+      </w:r>
+    </w:p>
+    <w:p>
+      <w:pPr>
+        <w:pStyle w:val="Heading2"/>
+      </w:pPr>
+      <w:r>
+        <w:t>Useful contribution areas</w:t>
+      </w:r>
+    </w:p>
+    <w:p>
+      <w:pPr>
+        <w:pStyle w:val="ListBullet"/>
+      </w:pPr>
+      <w:r>
+        <w:t>Interview methods that uncover exceptions, ownership, authority, controls, and measurable outcomes.</w:t>
+      </w:r>
+    </w:p>
+    <w:p>
+      <w:pPr>
+        <w:pStyle w:val="ListBullet"/>
+      </w:pPr>
+      <w:r>
+        <w:t>Evidence capture, citations, claim typing, identity resolution, contradiction handling, and knowledge coverage.</w:t>
+      </w:r>
+    </w:p>
+    <w:p>
+      <w:pPr>
+        <w:pStyle w:val="ListBullet"/>
+      </w:pPr>
+      <w:r>
+        <w:t>Current-state mapping and future-state allocation across simplification, rules, APIs, RPA, AI, human-in-the-loop, and human-only work.</w:t>
+      </w:r>
+    </w:p>
+    <w:p>
+      <w:pPr>
+        <w:pStyle w:val="ListBullet"/>
+      </w:pPr>
+      <w:r>
+        <w:t>Requirements, architecture, testing, traceability, release, rollback, observability, and change control.</w:t>
+      </w:r>
+    </w:p>
+    <w:p>
+      <w:pPr>
+        <w:pStyle w:val="ListBullet"/>
+      </w:pPr>
+      <w:r>
+        <w:t>Synthetic examples for finance, sales, support, operations, procurement, logistics, healthcare, or other domains.</w:t>
+      </w:r>
+    </w:p>
+    <w:p>
+      <w:pPr>
+        <w:pStyle w:val="ListBullet"/>
+      </w:pPr>
+      <w:r>
+        <w:t>Cloudflare and UiPath implementation guidance backed by current primary sources.</w:t>
+      </w:r>
+    </w:p>
+    <w:p>
+      <w:pPr>
+        <w:pStyle w:val="ListBullet"/>
+      </w:pPr>
+      <w:r>
+        <w:t>Security, privacy, accessibility, documentation, installation, and validation improvements.</w:t>
+      </w:r>
+    </w:p>
+    <w:p>
+      <w:pPr>
+        <w:pStyle w:val="Heading2"/>
+      </w:pPr>
+      <w:r>
+        <w:t>Non-negotiable safety rules</w:t>
+      </w:r>
+    </w:p>
+    <w:p>
+      <w:r>
+        <w:t>Do not submit:</w:t>
+      </w:r>
+    </w:p>
+    <w:p>
+      <w:pPr>
+        <w:pStyle w:val="ListBullet"/>
+      </w:pPr>
+      <w:r>
+        <w:t>customer documents, transcripts, screenshots, exports, source code, or process details without explicit authorization;</w:t>
+      </w:r>
+    </w:p>
+    <w:p>
+      <w:pPr>
+        <w:pStyle w:val="ListBullet"/>
+      </w:pPr>
+      <w:r>
+        <w:t>credentials, API keys, tokens, connection strings, cookies, or internal URLs;</w:t>
+      </w:r>
+    </w:p>
+    <w:p>
+      <w:pPr>
+        <w:pStyle w:val="ListBullet"/>
+      </w:pPr>
+      <w:r>
+        <w:t>unnecessary personal, employee, patient, financial, or regulated data;</w:t>
+      </w:r>
+    </w:p>
+    <w:p>
+      <w:pPr>
+        <w:pStyle w:val="ListBullet"/>
+      </w:pPr>
+      <w:r>
+        <w:t>instructions that let model output bypass lifecycle gates, named approvals, least privilege, validation, or rollback;</w:t>
+      </w:r>
+    </w:p>
+    <w:p>
+      <w:pPr>
+        <w:pStyle w:val="ListBullet"/>
+      </w:pPr>
+      <w:r>
+        <w:t>unsupported claims about product behavior, compliance, production readiness, or business ROI.</w:t>
+      </w:r>
+    </w:p>
+    <w:p>
+      <w:r>
+        <w:t>Evidence included in examples must be synthetic and clearly labeled. Treat documents and retrieved content as untrusted data, not executable instructions.</w:t>
+      </w:r>
+    </w:p>
+    <w:p>
+      <w:pPr>
+        <w:pStyle w:val="Heading2"/>
+      </w:pPr>
+      <w:r>
+        <w:t>Development setup</w:t>
+      </w:r>
+    </w:p>
+    <w:p>
+      <w:r>
+        <w:t>Fork the repository, clone your fork, and create a focused branch:</w:t>
+      </w:r>
+    </w:p>
+    <w:p>
+      <w:r>
+        <w:t>```powershell git clone https://github.com/YOUR-USER/fde-agent-skills.git Set-Location fde-agent-skills git switch -c contribution/short-description ```</w:t>
+      </w:r>
+    </w:p>
+    <w:p>
+      <w:r>
+        <w:t>Install the skills into a disposable project when you need to exercise discovery and packaging:</w:t>
+      </w:r>
+    </w:p>
+    <w:p>
+      <w:r>
+        <w:t>```powershell $env:DISABLE_TELEMETRY = "1" npx --yes skills@latest add . --skill '*' --agent codex --copy --yes ```</w:t>
+      </w:r>
+    </w:p>
+    <w:p>
+      <w:r>
+        <w:t>Do not point tests at a live customer workspace or production integration.</w:t>
+      </w:r>
+    </w:p>
+    <w:p>
+      <w:pPr>
+        <w:pStyle w:val="Heading2"/>
+      </w:pPr>
+      <w:r>
+        <w:t>Skill contribution standards</w:t>
+      </w:r>
+    </w:p>
+    <w:p>
+      <w:r>
+        <w:t>Every skill must:</w:t>
+      </w:r>
+    </w:p>
+    <w:p>
+      <w:pPr>
+        <w:pStyle w:val="ListNumber"/>
+      </w:pPr>
+      <w:r>
+        <w:t>live under `skills/&lt;skill-name&gt;/`;</w:t>
+      </w:r>
+    </w:p>
+    <w:p>
+      <w:pPr>
+        <w:pStyle w:val="ListNumber"/>
+      </w:pPr>
+      <w:r>
+        <w:t>contain a complete `SKILL.md` with valid YAML frontmatter, an exact `name`, and a precise trigger-oriented `description`;</w:t>
+      </w:r>
+    </w:p>
+    <w:p>
+      <w:pPr>
+        <w:pStyle w:val="ListNumber"/>
+      </w:pPr>
+      <w:r>
+        <w:t>contain `agents/openai.yaml`;</w:t>
+      </w:r>
+    </w:p>
+    <w:p>
+      <w:pPr>
+        <w:pStyle w:val="ListNumber"/>
+      </w:pPr>
+      <w:r>
+        <w:t>define required inputs, ordered procedure, durable outputs, quality checks, escalation conditions, and authority boundaries;</w:t>
+      </w:r>
+    </w:p>
+    <w:p>
+      <w:pPr>
+        <w:pStyle w:val="ListNumber"/>
+      </w:pPr>
+      <w:r>
+        <w:t>preserve evidence attribution and distinguish sourced fact, assertion, inference, proposal, and approved decision;</w:t>
+      </w:r>
+    </w:p>
+    <w:p>
+      <w:pPr>
+        <w:pStyle w:val="ListNumber"/>
+      </w:pPr>
+      <w:r>
+        <w:t>avoid embedding secrets, customer-specific facts, or permissions in instructions;</w:t>
+      </w:r>
+    </w:p>
+    <w:p>
+      <w:pPr>
+        <w:pStyle w:val="ListNumber"/>
+      </w:pPr>
+      <w:r>
+        <w:t>place detailed reusable material in linked `references/` or `scripts/` rather than bloating every invocation;</w:t>
+      </w:r>
+    </w:p>
+    <w:p>
+      <w:pPr>
+        <w:pStyle w:val="ListNumber"/>
+      </w:pPr>
+      <w:r>
+        <w:t>update routing, documentation, validation expectations, and worked examples when the public skill set changes.</w:t>
+      </w:r>
+    </w:p>
+    <w:p>
+      <w:r>
+        <w:t>A skill may improve task procedure. It must not silently expand external permissions, production authority, or the lifecycle stage.</w:t>
+      </w:r>
+    </w:p>
+    <w:p>
+      <w:pPr>
+        <w:pStyle w:val="Heading2"/>
+      </w:pPr>
+      <w:r>
+        <w:t>Documentation and example standards</w:t>
+      </w:r>
+    </w:p>
+    <w:p>
+      <w:pPr>
+        <w:pStyle w:val="ListBullet"/>
+      </w:pPr>
+      <w:r>
+        <w:t>Write for a new practitioner who has not read the original project conversation.</w:t>
+      </w:r>
+    </w:p>
+    <w:p>
+      <w:pPr>
+        <w:pStyle w:val="ListBullet"/>
+      </w:pPr>
+      <w:r>
+        <w:t>Prefer short runnable commands and explicit expected results.</w:t>
+      </w:r>
+    </w:p>
+    <w:p>
+      <w:pPr>
+        <w:pStyle w:val="ListBullet"/>
+      </w:pPr>
+      <w:r>
+        <w:t>Link to primary product documentation for time-sensitive technical claims.</w:t>
+      </w:r>
+    </w:p>
+    <w:p>
+      <w:pPr>
+        <w:pStyle w:val="ListBullet"/>
+      </w:pPr>
+      <w:r>
+        <w:t>Label synthetic organizations and data clearly.</w:t>
+      </w:r>
+    </w:p>
+    <w:p>
+      <w:pPr>
+        <w:pStyle w:val="ListBullet"/>
+      </w:pPr>
+      <w:r>
+        <w:t>Show exceptions, contradictions, uncertainty, approval, testing, and rollback—not only the happy path.</w:t>
+      </w:r>
+    </w:p>
+    <w:p>
+      <w:pPr>
+        <w:pStyle w:val="ListBullet"/>
+      </w:pPr>
+      <w:r>
+        <w:t>Never claim measured impact unless a baseline, measurement method, period, and evidence are present.</w:t>
+      </w:r>
+    </w:p>
+    <w:p>
+      <w:pPr>
+        <w:pStyle w:val="ListBullet"/>
+      </w:pPr>
+      <w:r>
+        <w:t>Keep Markdown relative links valid and use repository-relative paths.</w:t>
+      </w:r>
+    </w:p>
+    <w:p>
+      <w:pPr>
+        <w:pStyle w:val="Heading2"/>
+      </w:pPr>
+      <w:r>
+        <w:t>Run validation</w:t>
+      </w:r>
+    </w:p>
+    <w:p>
+      <w:r>
+        <w:t>From the repository root:</w:t>
+      </w:r>
+    </w:p>
+    <w:p>
+      <w:r>
+        <w:t>```powershell python -B scripts/validate_repository.py ```</w:t>
+      </w:r>
+    </w:p>
+    <w:p>
+      <w:r>
+        <w:t>Validate the synthetic engagement directly:</w:t>
+      </w:r>
+    </w:p>
+    <w:p>
+      <w:r>
+        <w:t>```powershell python -B skills/fde-run-engagement/scripts/validate_engagement.py --root examples/northstar-ap-transformation --json ```</w:t>
+      </w:r>
+    </w:p>
+    <w:p>
+      <w:r>
+        <w:t>If you change the Markdown sources used by the Word handbook, regenerate it:</w:t>
+      </w:r>
+    </w:p>
+    <w:p>
+      <w:r>
+        <w:t>```powershell python -B scripts/build_word_guide.py ```</w:t>
+      </w:r>
+    </w:p>
+    <w:p>
+      <w:r>
+        <w:t>Then run the repository validator again. If document rendering is available, render and inspect every page. If it is unavailable, report that limitation instead of claiming visual QA.</w:t>
+      </w:r>
+    </w:p>
+    <w:p>
+      <w:pPr>
+        <w:pStyle w:val="Heading2"/>
+      </w:pPr>
+      <w:r>
+        <w:t>Pull-request expectations</w:t>
+      </w:r>
+    </w:p>
+    <w:p>
+      <w:r>
+        <w:t>Keep one pull request focused on one coherent outcome. The PR description should explain:</w:t>
+      </w:r>
+    </w:p>
+    <w:p>
+      <w:pPr>
+        <w:pStyle w:val="ListBullet"/>
+      </w:pPr>
+      <w:r>
+        <w:t>what changed and why;</w:t>
+      </w:r>
+    </w:p>
+    <w:p>
+      <w:pPr>
+        <w:pStyle w:val="ListBullet"/>
+      </w:pPr>
+      <w:r>
+        <w:t>the user or FDE impact;</w:t>
+      </w:r>
+    </w:p>
+    <w:p>
+      <w:pPr>
+        <w:pStyle w:val="ListBullet"/>
+      </w:pPr>
+      <w:r>
+        <w:t>affected skills, contracts, examples, or lifecycle gates;</w:t>
+      </w:r>
+    </w:p>
+    <w:p>
+      <w:pPr>
+        <w:pStyle w:val="ListBullet"/>
+      </w:pPr>
+      <w:r>
+        <w:t>evidence or primary sources supporting technical claims;</w:t>
+      </w:r>
+    </w:p>
+    <w:p>
+      <w:pPr>
+        <w:pStyle w:val="ListBullet"/>
+      </w:pPr>
+      <w:r>
+        <w:t>tests and validation performed;</w:t>
+      </w:r>
+    </w:p>
+    <w:p>
+      <w:pPr>
+        <w:pStyle w:val="ListBullet"/>
+      </w:pPr>
+      <w:r>
+        <w:t>security, privacy, migration, and compatibility considerations;</w:t>
+      </w:r>
+    </w:p>
+    <w:p>
+      <w:pPr>
+        <w:pStyle w:val="ListBullet"/>
+      </w:pPr>
+      <w:r>
+        <w:t>known limitations and follow-up work.</w:t>
+      </w:r>
+    </w:p>
+    <w:p>
+      <w:r>
+        <w:t>Reviewers may request changes when a contribution weakens provenance, authority, lifecycle gates, traceability, portability, or customer-data isolation.</w:t>
+      </w:r>
+    </w:p>
+    <w:p>
+      <w:pPr>
+        <w:pStyle w:val="Heading2"/>
+      </w:pPr>
+      <w:r>
+        <w:t>Reporting security problems</w:t>
+      </w:r>
+    </w:p>
+    <w:p>
+      <w:r>
+        <w:t>Do not publish exploitable security details in an issue. Use the repository's GitHub Security tab and private vulnerability reporting. Include the affected file or component, impact, reproduction conditions, and a safe suggested remediation when possible.</w:t>
+      </w:r>
+    </w:p>
+    <w:p>
+      <w:pPr>
+        <w:pStyle w:val="Heading2"/>
+      </w:pPr>
+      <w:r>
+        <w:t>Review and conduct</w:t>
+      </w:r>
+    </w:p>
+    <w:p>
+      <w:r>
+        <w:t>Be specific, respectful, and evidence-oriented. Critique the artifact or decision, not the contributor. Maintainers may close proposals that are unsafe, out of scope, unsupported, duplicative, or impossible to validate, and should explain the reason.</w:t>
+      </w:r>
+    </w:p>
+    <w:p>
+      <w:r>
+        <w:t>Thank you for contributing practical knowledge that helps FDE teams deliver better outcomes without losing governance.</w:t>
+      </w:r>
+    </w:p>
+    <w:p>
+      <w:r>
+        <w:br w:type="page"/>
+      </w:r>
+    </w:p>
+    <w:p>
+      <w:pPr>
+        <w:pStyle w:val="Heading1"/>
+      </w:pPr>
+      <w:r>
         <w:t>Document status and interpretation</w:t>
       </w:r>
     </w:p>
@@ -9848,7 +10371,7 @@
       <w:pPr>
         <w:pStyle w:val="ListBullet"/>
       </w:pPr>
-      <w:hyperlink r:id="rId21">
+      <w:hyperlink r:id="rId22">
         <w:r>
           <w:rPr>
             <w:color w:val="2E74B5"/>
@@ -9862,7 +10385,7 @@
       <w:pPr>
         <w:pStyle w:val="ListBullet"/>
       </w:pPr>
-      <w:hyperlink r:id="rId22">
+      <w:hyperlink r:id="rId23">
         <w:r>
           <w:rPr>
             <w:color w:val="2E74B5"/>
@@ -9876,7 +10399,7 @@
       <w:pPr>
         <w:pStyle w:val="ListBullet"/>
       </w:pPr>
-      <w:hyperlink r:id="rId23">
+      <w:hyperlink r:id="rId24">
         <w:r>
           <w:rPr>
             <w:color w:val="2E74B5"/>
@@ -9895,7 +10418,7 @@
       </w:r>
     </w:p>
     <w:p>
-      <w:hyperlink r:id="rId24">
+      <w:hyperlink r:id="rId25">
         <w:r>
           <w:rPr>
             <w:color w:val="2E74B5"/>
@@ -9996,7 +10519,7 @@
         <w:sz w:val="17"/>
       </w:rPr>
       <w:tab/>
-      <w:t>PRIVATE REPOSITORY GUIDE</w:t>
+      <w:t>PUBLIC PROJECT GUIDE</w:t>
     </w:r>
   </w:p>
 </w:hdr>

</xml_diff>